<commit_message>
Fix SearchByIdModal getReportCriticalityType call
</commit_message>
<xml_diff>
--- a/docs/Capstone_Project_Phase_B.docx
+++ b/docs/Capstone_Project_Phase_B.docx
@@ -3127,13 +3127,8 @@
         </w:numPr>
       </w:pPr>
       <w:r>
-        <w:t xml:space="preserve">Severity </w:t>
-      </w:r>
-      <w:proofErr w:type="spellStart"/>
-      <w:r>
-        <w:t>classification</w:t>
-      </w:r>
-      <w:proofErr w:type="spellEnd"/>
+        <w:t>Severity classification</w:t>
+      </w:r>
     </w:p>
     <w:p>
       <w:pPr>
@@ -3968,21 +3963,7 @@
         <w:rPr>
           <w:lang w:bidi="he-IL"/>
         </w:rPr>
-        <w:t xml:space="preserve"> because I assume that there is connection to the municipal database, and </w:t>
-      </w:r>
-      <w:proofErr w:type="spellStart"/>
-      <w:r>
-        <w:rPr>
-          <w:lang w:bidi="he-IL"/>
-        </w:rPr>
-        <w:t>MuniMap</w:t>
-      </w:r>
-      <w:proofErr w:type="spellEnd"/>
-      <w:r>
-        <w:rPr>
-          <w:lang w:bidi="he-IL"/>
-        </w:rPr>
-        <w:t xml:space="preserve"> system is always fetching the new data from their data base.</w:t>
+        <w:t xml:space="preserve"> because I assume that there is connection to the municipal database, and MuniMap system is always fetching the new data from their data base.</w:t>
       </w:r>
     </w:p>
     <w:p>
@@ -4131,26 +4112,6 @@
     </w:p>
     <w:p>
       <w:pPr>
-        <w:pStyle w:val="ListBullet"/>
-      </w:pPr>
-      <w:r>
-        <w:rPr>
-          <w:b/>
-          <w:bCs/>
-        </w:rPr>
-        <w:t>Developer Tools</w:t>
-      </w:r>
-      <w:r>
-        <w:t>: Test report generator and anomaly threshold calculator for QA purposes</w:t>
-      </w:r>
-    </w:p>
-    <w:p>
-      <w:r>
-        <w:t>---</w:t>
-      </w:r>
-    </w:p>
-    <w:p>
-      <w:pPr>
         <w:pStyle w:val="Heading1"/>
       </w:pPr>
       <w:r>
@@ -4167,23 +4128,18 @@
     </w:p>
     <w:p>
       <w:r>
-        <w:t xml:space="preserve">The </w:t>
+        <w:t>MuniMap system follows a modern web application architecture with clear separation between client-side presentation, server-side processing, and cloud-based data storage</w:t>
+      </w:r>
+      <w:r>
+        <w:t xml:space="preserve"> using </w:t>
       </w:r>
       <w:proofErr w:type="spellStart"/>
       <w:r>
-        <w:t>MuniMap</w:t>
+        <w:t>api</w:t>
       </w:r>
       <w:proofErr w:type="spellEnd"/>
       <w:r>
-        <w:t xml:space="preserve"> system follows </w:t>
-      </w:r>
-      <w:proofErr w:type="gramStart"/>
-      <w:r>
-        <w:t>a modern</w:t>
-      </w:r>
-      <w:proofErr w:type="gramEnd"/>
-      <w:r>
-        <w:t xml:space="preserve"> web application architecture with clear separation between client-side presentation, server-side processing, and cloud-based data storage.</w:t>
+        <w:t xml:space="preserve"> routes.</w:t>
       </w:r>
     </w:p>
     <w:p>
@@ -4212,6 +4168,9 @@
     <w:p>
       <w:pPr>
         <w:pStyle w:val="Heading3"/>
+        <w:rPr>
+          <w:lang w:bidi="he-IL"/>
+        </w:rPr>
       </w:pPr>
     </w:p>
     <w:p>
@@ -4346,7 +4305,7 @@
           </mc:Choice>
           <mc:Fallback>
             <w:pict>
-              <v:group w14:anchorId="1E4F6945" id="Group 9" o:spid="_x0000_s1026" style="position:absolute;margin-left:-15.85pt;margin-top:-63.3pt;width:475.05pt;height:772.35pt;z-index:251674112;mso-width-relative:margin;mso-height-relative:margin" coordsize="50633,94354" o:gfxdata="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">
+              <v:group w14:anchorId="69CF19B7" id="Group 9" o:spid="_x0000_s1026" style="position:absolute;margin-left:-15.85pt;margin-top:-63.3pt;width:475.05pt;height:772.35pt;z-index:251674112;mso-width-relative:margin;mso-height-relative:margin" coordsize="50633,94354" o:gfxdata="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">
                 <v:shapetype id="_x0000_t75" coordsize="21600,21600" o:spt="75" o:preferrelative="t" path="m@4@5l@4@11@9@11@9@5xe" filled="f" stroked="f">
                   <v:stroke joinstyle="miter"/>
                   <v:formulas>
@@ -5025,7 +4984,7 @@
           <w:lang w:bidi="he-IL"/>
         </w:rPr>
         <w:drawing>
-          <wp:anchor distT="0" distB="0" distL="114300" distR="114300" simplePos="0" relativeHeight="251662848" behindDoc="0" locked="0" layoutInCell="1" allowOverlap="1" wp14:anchorId="27D17C67" wp14:editId="54F1255B">
+          <wp:anchor distT="0" distB="0" distL="114300" distR="114300" simplePos="0" relativeHeight="251661824" behindDoc="0" locked="0" layoutInCell="1" allowOverlap="1" wp14:anchorId="27D17C67" wp14:editId="54F1255B">
             <wp:simplePos x="0" y="0"/>
             <wp:positionH relativeFrom="column">
               <wp:posOffset>-977900</wp:posOffset>
@@ -5089,7 +5048,7 @@
         <mc:AlternateContent>
           <mc:Choice Requires="wpg">
             <w:drawing>
-              <wp:anchor distT="0" distB="0" distL="114300" distR="114300" simplePos="0" relativeHeight="251647488" behindDoc="0" locked="0" layoutInCell="1" allowOverlap="1" wp14:anchorId="643F866A" wp14:editId="686A66A8">
+              <wp:anchor distT="0" distB="0" distL="114300" distR="114300" simplePos="0" relativeHeight="251646464" behindDoc="0" locked="0" layoutInCell="1" allowOverlap="1" wp14:anchorId="643F866A" wp14:editId="686A66A8">
                 <wp:simplePos x="0" y="0"/>
                 <wp:positionH relativeFrom="column">
                   <wp:posOffset>-382270</wp:posOffset>
@@ -5211,7 +5170,7 @@
           </mc:Choice>
           <mc:Fallback>
             <w:pict>
-              <v:group w14:anchorId="2F662BF4" id="Group 8" o:spid="_x0000_s1026" style="position:absolute;margin-left:-30.1pt;margin-top:-37.4pt;width:578.1pt;height:762.4pt;z-index:251647488;mso-width-relative:margin;mso-height-relative:margin" coordsize="41344,53130" o:gfxdata="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">
+              <v:group w14:anchorId="7A1951B0" id="Group 8" o:spid="_x0000_s1026" style="position:absolute;margin-left:-30.1pt;margin-top:-37.4pt;width:578.1pt;height:762.4pt;z-index:251646464;mso-width-relative:margin;mso-height-relative:margin" coordsize="41344,53130" o:gfxdata="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">
                 <v:shape id="Picture 1" o:spid="_x0000_s1027" type="#_x0000_t75" alt="A diagram of a flowchart&#10;&#10;AI-generated content may be incorrect." style="position:absolute;left:3918;width:37224;height:24333;visibility:visible;mso-wrap-style:square" o:gfxdata="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">
                   <v:imagedata r:id="rId19" o:title="A diagram of a flowchart&#10;&#10;AI-generated content may be incorrect"/>
                 </v:shape>

</xml_diff>